<commit_message>
docs: project report now reflects 18 rules; build_project_report.py reads rules dynamically from YAML
- Report table + prose dynamically sourced from rules/detection-rules.yaml
  (R-001..R-018, incl. R-016 Security-4663 FIM, R-017 Sysmon FileCreate,
  R-018 Sysmon startup process-launch) instead of a stale hardcoded 15-rule list.
- Source column mapped per-rule (nginx / UFW+nginx / SSH / winlogbeat 4663+Sysmon).
- Offline-friendly: dashboard figures stay as sample text (no live-ES dependency).
</commit_message>
<xml_diff>
--- a/reports/SOC-ify_Project_Report.docx
+++ b/reports/SOC-ify_Project_Report.docx
@@ -55,7 +55,7 @@
         <w:rPr>
           <w:b w:val="0"/>
         </w:rPr>
-        <w:t>SOC-ify là một Security Operations Center (SOC) thu nhỏ, có thể tái tạo (reproducible), xây dựng trên một Azure VM phơi bày có chủ đích, với mục tiêu biến log truy cập nginx thành một pipeline giám sát bảo mật hoàn chỉnh: Phát hiện → Triage → Báo cáo (detect → triage → report), kèm dashboard Kibana trực tiếp.</w:t>
+        <w:t>SOC-ify là một Security Operations Center (SOC) thu nhỏ, có thể tái tạo (reproducible), xây dựng trên một Azure VM phơi bày có chủ đích, với mục tiêu biến log truy cập nginx thành một pipeline giám sát bảo mật hoàn chỉnh: Phát hiện → Triage → Báo cáo (detect → triage → report), kèm dashboard Kibana trực tiếp. Bản nâng cấp mở rộng nguồn sang Windows endpoint (winlogbeat + Sysmon) cho FIM.</w:t>
       </w:r>
     </w:p>
     <w:p>
@@ -82,7 +82,7 @@
         <w:rPr>
           <w:b w:val="0"/>
         </w:rPr>
-        <w:t>Luồng dữ liệu: Internet → Azure VM → nginx (+ ModSecurity CRS + geo-block VN-only). Filebeat thu thập 3 nguồn log rồi đẩy về Elasticsearch:</w:t>
+        <w:t>Luồng dữ liệu: Internet → Azure VM → nginx (+ ModSecurity CRS + geo-block VN-only). Filebeat thu thập 3 nguồn log rồi đẩy về Elasticsearch; winlogbeat phía Windows endpoint gửi bổ sung log Security (4663) + Sysmon:</w:t>
       </w:r>
     </w:p>
     <w:p>
@@ -110,6 +110,14 @@
       </w:r>
     </w:p>
     <w:p>
+      <w:pPr>
+        <w:pStyle w:val="ListBullet"/>
+      </w:pPr>
+      <w:r>
+        <w:t>Windows endpoint  → winlogbeat-* (Security 4663 + Sysmon/Operational) → R-016/017/018</w:t>
+      </w:r>
+    </w:p>
+    <w:p>
       <w:r>
         <w:rPr>
           <w:b w:val="0"/>
@@ -130,7 +138,7 @@
         <w:pStyle w:val="ListBullet"/>
       </w:pPr>
       <w:r>
-        <w:t>scripts/apply_rules.py (chạy định kỳ ~10 phút) quét log, gắn rule ID (R-001..R-015), ghi findings vào index siem-findings — với key {rule, src_ip, window} ổn định để khử trùng lặp.</w:t>
+        <w:t>scripts/apply_rules.py (chạy định kỳ ~10 phút) quét các nguồn, gắn rule ID (R-001…R-018 = 18 rule), ghi findings vào index siem-findings — với key {rule, src_ip, window} ổn định để khử trùng lặp.</w:t>
       </w:r>
     </w:p>
     <w:p>
@@ -181,7 +189,7 @@
         <w:pStyle w:val="ListBullet"/>
       </w:pPr>
       <w:r>
-        <w:t>15 detection rules kiểu Sigma, ánh xạ MITRE ATT&amp;CK.</w:t>
+        <w:t>18 detection rules kiểu Sigma, ánh xạ MITRE ATT&amp;CK.</w:t>
       </w:r>
     </w:p>
     <w:p>
@@ -189,7 +197,15 @@
         <w:pStyle w:val="ListBullet"/>
       </w:pPr>
       <w:r>
-        <w:t>Tương quan đa nguồn (multi-source): nginx + UFW firewall + SSH auth (R-013/R-014/R-015).</w:t>
+        <w:t>Tương quan đa nguồn: nginx + UFW firewall + SSH auth (R-013/R-014/R-015).</w:t>
+      </w:r>
+    </w:p>
+    <w:p>
+      <w:pPr>
+        <w:pStyle w:val="ListBullet"/>
+      </w:pPr>
+      <w:r>
+        <w:t>Giám sát Integrity endpoint (FIM): Security 4663 (R-016) + Sysmon FileCreate (R-017, event 11) + Sysmon process-launch — kiểm chứng Startup/persistence (R-018).</w:t>
       </w:r>
     </w:p>
     <w:p>
@@ -232,7 +248,7 @@
         <w:rPr>
           <w:color w:val="1F3A5F"/>
         </w:rPr>
-        <w:t>4. Detection Rules (R-001…R-015)</w:t>
+        <w:t>4. Detection Rules (R-001…R-018)</w:t>
       </w:r>
     </w:p>
     <w:p>
@@ -240,7 +256,7 @@
         <w:rPr>
           <w:b w:val="0"/>
         </w:rPr>
-        <w:t>15 rule bao phủ từ chữ ký đơn-request đến tương quan tần suất, chuỗi tấn công và đa nguồn. Tất cả ánh xạ MITRE ATT&amp;CK.</w:t>
+        <w:t>18 rule bao phủ từ chữ ký đơn-request đến tương quan tần suất, chuỗi tấn công, đa nguồn và FIM endpoint. Tất cả ánh xạ MITRE ATT&amp;CK.</w:t>
       </w:r>
     </w:p>
     <w:tbl>
@@ -341,7 +357,7 @@
           </w:tcPr>
           <w:p>
             <w:r>
-              <w:t>SQL Injection</w:t>
+              <w:t>SQL Injection - Classic Payload</w:t>
             </w:r>
           </w:p>
         </w:tc>
@@ -351,7 +367,7 @@
           </w:tcPr>
           <w:p>
             <w:r>
-              <w:t>3</w:t>
+              <w:t>HIGH</w:t>
             </w:r>
           </w:p>
         </w:tc>
@@ -393,7 +409,7 @@
           </w:tcPr>
           <w:p>
             <w:r>
-              <w:t>XSS Attempt</w:t>
+              <w:t>Cross-Site Scripting (XSS) Attempt</w:t>
             </w:r>
           </w:p>
         </w:tc>
@@ -403,7 +419,7 @@
           </w:tcPr>
           <w:p>
             <w:r>
-              <w:t>2</w:t>
+              <w:t>MEDIUM</w:t>
             </w:r>
           </w:p>
         </w:tc>
@@ -445,7 +461,7 @@
           </w:tcPr>
           <w:p>
             <w:r>
-              <w:t>Path Traversal / LFI</w:t>
+              <w:t>Path Traversal / Local File Inclusion</w:t>
             </w:r>
           </w:p>
         </w:tc>
@@ -455,7 +471,7 @@
           </w:tcPr>
           <w:p>
             <w:r>
-              <w:t>3</w:t>
+              <w:t>HIGH</w:t>
             </w:r>
           </w:p>
         </w:tc>
@@ -497,7 +513,7 @@
           </w:tcPr>
           <w:p>
             <w:r>
-              <w:t>Command Injection</w:t>
+              <w:t>Command Injection Attempt</w:t>
             </w:r>
           </w:p>
         </w:tc>
@@ -507,7 +523,7 @@
           </w:tcPr>
           <w:p>
             <w:r>
-              <w:t>4</w:t>
+              <w:t>CRITICAL</w:t>
             </w:r>
           </w:p>
         </w:tc>
@@ -549,7 +565,7 @@
           </w:tcPr>
           <w:p>
             <w:r>
-              <w:t>Sensitive File Disclosure</w:t>
+              <w:t>Sensitive File / Source Disclosure</w:t>
             </w:r>
           </w:p>
         </w:tc>
@@ -559,7 +575,7 @@
           </w:tcPr>
           <w:p>
             <w:r>
-              <w:t>4</w:t>
+              <w:t>CRITICAL</w:t>
             </w:r>
           </w:p>
         </w:tc>
@@ -601,7 +617,7 @@
           </w:tcPr>
           <w:p>
             <w:r>
-              <w:t>SSRF</w:t>
+              <w:t>Server-Side Request Forgery</w:t>
             </w:r>
           </w:p>
         </w:tc>
@@ -611,7 +627,7 @@
           </w:tcPr>
           <w:p>
             <w:r>
-              <w:t>3</w:t>
+              <w:t>HIGH</w:t>
             </w:r>
           </w:p>
         </w:tc>
@@ -653,7 +669,7 @@
           </w:tcPr>
           <w:p>
             <w:r>
-              <w:t>Scanner UA</w:t>
+              <w:t>Vulnerability Scanner User-Agent</w:t>
             </w:r>
           </w:p>
         </w:tc>
@@ -663,7 +679,7 @@
           </w:tcPr>
           <w:p>
             <w:r>
-              <w:t>1</w:t>
+              <w:t>LOW</w:t>
             </w:r>
           </w:p>
         </w:tc>
@@ -705,7 +721,7 @@
           </w:tcPr>
           <w:p>
             <w:r>
-              <w:t>Admin Panel Probe</w:t>
+              <w:t>Admin / Management Panel Probe</w:t>
             </w:r>
           </w:p>
         </w:tc>
@@ -715,7 +731,7 @@
           </w:tcPr>
           <w:p>
             <w:r>
-              <w:t>2</w:t>
+              <w:t>MEDIUM</w:t>
             </w:r>
           </w:p>
         </w:tc>
@@ -757,7 +773,7 @@
           </w:tcPr>
           <w:p>
             <w:r>
-              <w:t>Auth Endpoint Scan</w:t>
+              <w:t>Authentication Endpoint Scan</w:t>
             </w:r>
           </w:p>
         </w:tc>
@@ -767,7 +783,7 @@
           </w:tcPr>
           <w:p>
             <w:r>
-              <w:t>2</w:t>
+              <w:t>MEDIUM</w:t>
             </w:r>
           </w:p>
         </w:tc>
@@ -809,7 +825,7 @@
           </w:tcPr>
           <w:p>
             <w:r>
-              <w:t>Geo-block bypass probe</w:t>
+              <w:t>Attempted Access from Non-VN Geo (hit geo-block 403)</w:t>
             </w:r>
           </w:p>
         </w:tc>
@@ -819,7 +835,7 @@
           </w:tcPr>
           <w:p>
             <w:r>
-              <w:t>1</w:t>
+              <w:t>LOW</w:t>
             </w:r>
           </w:p>
         </w:tc>
@@ -861,7 +877,7 @@
           </w:tcPr>
           <w:p>
             <w:r>
-              <w:t>High Request Rate (freq)</w:t>
+              <w:t>High Request Rate - Single Source (Scan / Brute-force)</w:t>
             </w:r>
           </w:p>
         </w:tc>
@@ -871,7 +887,7 @@
           </w:tcPr>
           <w:p>
             <w:r>
-              <w:t>2</w:t>
+              <w:t>MEDIUM</w:t>
             </w:r>
           </w:p>
         </w:tc>
@@ -891,7 +907,7 @@
           </w:tcPr>
           <w:p>
             <w:r>
-              <w:t>nginx</w:t>
+              <w:t>nginx-access-*</w:t>
             </w:r>
           </w:p>
         </w:tc>
@@ -913,7 +929,7 @@
           </w:tcPr>
           <w:p>
             <w:r>
-              <w:t>Attack Chain correlation</w:t>
+              <w:t>Potential Attack Chain (Persistent Source)</w:t>
             </w:r>
           </w:p>
         </w:tc>
@@ -923,7 +939,7 @@
           </w:tcPr>
           <w:p>
             <w:r>
-              <w:t>3</w:t>
+              <w:t>HIGH</w:t>
             </w:r>
           </w:p>
         </w:tc>
@@ -943,7 +959,7 @@
           </w:tcPr>
           <w:p>
             <w:r>
-              <w:t>nginx</w:t>
+              <w:t>nginx-access-*</w:t>
             </w:r>
           </w:p>
         </w:tc>
@@ -965,7 +981,7 @@
           </w:tcPr>
           <w:p>
             <w:r>
-              <w:t>Firewall+Web correlation</w:t>
+              <w:t>Firewall+Web Correlation - Multi-Layer Attacker</w:t>
             </w:r>
           </w:p>
         </w:tc>
@@ -975,7 +991,7 @@
           </w:tcPr>
           <w:p>
             <w:r>
-              <w:t>2-3</w:t>
+              <w:t>MEDIUM</w:t>
             </w:r>
           </w:p>
         </w:tc>
@@ -1017,7 +1033,7 @@
           </w:tcPr>
           <w:p>
             <w:r>
-              <w:t>SSH Brute-Force</w:t>
+              <w:t>SSH Brute-Force - Repeated Failed Logins</w:t>
             </w:r>
           </w:p>
         </w:tc>
@@ -1027,7 +1043,7 @@
           </w:tcPr>
           <w:p>
             <w:r>
-              <w:t>3</w:t>
+              <w:t>HIGH</w:t>
             </w:r>
           </w:p>
         </w:tc>
@@ -1069,7 +1085,7 @@
           </w:tcPr>
           <w:p>
             <w:r>
-              <w:t>SSH Cross-Source correlation</w:t>
+              <w:t>SSH Cross-Source Correlation - Host+Network Attacker</w:t>
             </w:r>
           </w:p>
         </w:tc>
@@ -1079,7 +1095,7 @@
           </w:tcPr>
           <w:p>
             <w:r>
-              <w:t>1-3</w:t>
+              <w:t>MEDIUM</w:t>
             </w:r>
           </w:p>
         </w:tc>
@@ -1104,6 +1120,162 @@
           </w:p>
         </w:tc>
       </w:tr>
+      <w:tr>
+        <w:tc>
+          <w:tcPr>
+            <w:tcW w:type="dxa" w:w="1728"/>
+          </w:tcPr>
+          <w:p>
+            <w:r>
+              <w:t>R-016</w:t>
+            </w:r>
+          </w:p>
+        </w:tc>
+        <w:tc>
+          <w:tcPr>
+            <w:tcW w:type="dxa" w:w="1728"/>
+          </w:tcPr>
+          <w:p>
+            <w:r>
+              <w:t>Sensitive File Modified - Integrity Correlation</w:t>
+            </w:r>
+          </w:p>
+        </w:tc>
+        <w:tc>
+          <w:tcPr>
+            <w:tcW w:type="dxa" w:w="1728"/>
+          </w:tcPr>
+          <w:p>
+            <w:r>
+              <w:t>HIGH</w:t>
+            </w:r>
+          </w:p>
+        </w:tc>
+        <w:tc>
+          <w:tcPr>
+            <w:tcW w:type="dxa" w:w="1728"/>
+          </w:tcPr>
+          <w:p>
+            <w:r>
+              <w:t>file_integrity</w:t>
+            </w:r>
+          </w:p>
+        </w:tc>
+        <w:tc>
+          <w:tcPr>
+            <w:tcW w:type="dxa" w:w="1728"/>
+          </w:tcPr>
+          <w:p>
+            <w:r>
+              <w:t>winlogbeat (4663)</w:t>
+            </w:r>
+          </w:p>
+        </w:tc>
+      </w:tr>
+      <w:tr>
+        <w:tc>
+          <w:tcPr>
+            <w:tcW w:type="dxa" w:w="1728"/>
+          </w:tcPr>
+          <w:p>
+            <w:r>
+              <w:t>R-017</w:t>
+            </w:r>
+          </w:p>
+        </w:tc>
+        <w:tc>
+          <w:tcPr>
+            <w:tcW w:type="dxa" w:w="1728"/>
+          </w:tcPr>
+          <w:p>
+            <w:r>
+              <w:t>Sysmon File Created in Sensitive Location</w:t>
+            </w:r>
+          </w:p>
+        </w:tc>
+        <w:tc>
+          <w:tcPr>
+            <w:tcW w:type="dxa" w:w="1728"/>
+          </w:tcPr>
+          <w:p>
+            <w:r>
+              <w:t>HIGH</w:t>
+            </w:r>
+          </w:p>
+        </w:tc>
+        <w:tc>
+          <w:tcPr>
+            <w:tcW w:type="dxa" w:w="1728"/>
+          </w:tcPr>
+          <w:p>
+            <w:r>
+              <w:t>file_integrity</w:t>
+            </w:r>
+          </w:p>
+        </w:tc>
+        <w:tc>
+          <w:tcPr>
+            <w:tcW w:type="dxa" w:w="1728"/>
+          </w:tcPr>
+          <w:p>
+            <w:r>
+              <w:t>winlogbeat (Sysmon evt 11)</w:t>
+            </w:r>
+          </w:p>
+        </w:tc>
+      </w:tr>
+      <w:tr>
+        <w:tc>
+          <w:tcPr>
+            <w:tcW w:type="dxa" w:w="1728"/>
+          </w:tcPr>
+          <w:p>
+            <w:r>
+              <w:t>R-018</w:t>
+            </w:r>
+          </w:p>
+        </w:tc>
+        <w:tc>
+          <w:tcPr>
+            <w:tcW w:type="dxa" w:w="1728"/>
+          </w:tcPr>
+          <w:p>
+            <w:r>
+              <w:t>Sysmon Process Launched from Startup Path</w:t>
+            </w:r>
+          </w:p>
+        </w:tc>
+        <w:tc>
+          <w:tcPr>
+            <w:tcW w:type="dxa" w:w="1728"/>
+          </w:tcPr>
+          <w:p>
+            <w:r>
+              <w:t>HIGH</w:t>
+            </w:r>
+          </w:p>
+        </w:tc>
+        <w:tc>
+          <w:tcPr>
+            <w:tcW w:type="dxa" w:w="1728"/>
+          </w:tcPr>
+          <w:p>
+            <w:r>
+              <w:t>persistence</w:t>
+            </w:r>
+          </w:p>
+        </w:tc>
+        <w:tc>
+          <w:tcPr>
+            <w:tcW w:type="dxa" w:w="1728"/>
+          </w:tcPr>
+          <w:p>
+            <w:r>
+              <w:t>winlogbeat (Sysmon evt 1)</w:t>
+            </w:r>
+          </w:p>
+        </w:tc>
+      </w:tr>
     </w:tbl>
     <w:p>
       <w:r>
@@ -1117,7 +1289,7 @@
         <w:rPr>
           <w:b w:val="0"/>
         </w:rPr>
-        <w:t>Giá trị gia tăng cốt lõi: tương quan — đơn nguồn (R-011/R-012) và đa nguồn (R-013/R-015) xuyên nginx + UFW + SSH, cùng hàng đợi triage bền vững mà chỉ WAF lớp-7 không cung cấp được.</w:t>
+        <w:t>Giá trị gia tăng cốt lõi: tương quan — đơn nguồn (R-011/R-012), đa nguồn (R-013/R-015) xuyên nginx + UFW + SSH, và in-host FIM (R-016/017/018) nối nguồn Windows — mà chỉ WAF lớp-7 không cung cấp được.</w:t>
       </w:r>
     </w:p>
     <w:p>
@@ -1144,7 +1316,7 @@
         <w:rPr>
           <w:b/>
         </w:rPr>
-        <w:t>Số liệu mẫu (24h gần nhất):</w:t>
+        <w:t>Số liệu mẫu (24h gần nhất — cập nhật thủ công; báo cáo không nối ES để chạy offline):</w:t>
       </w:r>
     </w:p>
     <w:p>
@@ -1152,7 +1324,7 @@
         <w:pStyle w:val="ListBullet"/>
       </w:pPr>
       <w:r>
-        <w:t>Severity: Critical 7, High 14, Medium 9, Low 1 (tổng 31 findings) — 68% ở mức High/Critical.</w:t>
+        <w:t>Severity: Mixed nginx + Windows — chiếm ưu thế SSH brute-force (credential-access) và FIM (defense-evasion).</w:t>
       </w:r>
     </w:p>
     <w:p>
@@ -1160,7 +1332,7 @@
         <w:pStyle w:val="ListBullet"/>
       </w:pPr>
       <w:r>
-        <w:t>Rule nổi bật: R-014 SSH brute-force (14), R-005 info disclosure (7), R-008 admin-panel scan (5).</w:t>
+        <w:t>Rule nổi bật từ nginx: R-014 SSH brute-force, R-005 info disclosure, R-008 admin-panel scan; từ endpoint: R-016/R-017 file-integrity.</w:t>
       </w:r>
     </w:p>
     <w:p>
@@ -1168,7 +1340,7 @@
         <w:pStyle w:val="ListBullet"/>
       </w:pPr>
       <w:r>
-        <w:t>MITRE Tactic: credential-access (18) chiếm ưu thế.</w:t>
+        <w:t>MITRE Tactic chính: credential-access, defense-evasion, initial-access.</w:t>
       </w:r>
     </w:p>
     <w:p>
@@ -1176,23 +1348,7 @@
         <w:pStyle w:val="ListBullet"/>
       </w:pPr>
       <w:r>
-        <w:t>Status: 31 findings đều open (chưa triage).</w:t>
-      </w:r>
-    </w:p>
-    <w:p>
-      <w:pPr>
-        <w:pStyle w:val="ListBullet"/>
-      </w:pPr>
-      <w:r>
-        <w:t>SSH top IP: 45.148.10.157 (125 lần login failure).</w:t>
-      </w:r>
-    </w:p>
-    <w:p>
-      <w:pPr>
-        <w:pStyle w:val="ListBullet"/>
-      </w:pPr>
-      <w:r>
-        <w:t>UFW top IP: 13.75.39.76 (38 lần bị chặn).</w:t>
+        <w:t>Status: findings đều open → triage qua triage.py.</w:t>
       </w:r>
     </w:p>
     <w:p>
@@ -1227,7 +1383,7 @@
         <w:pStyle w:val="ListBullet"/>
       </w:pPr>
       <w:r>
-        <w:t>rules/detection-rules.yaml — 15 rule Sigma-style</w:t>
+        <w:t>rules/detection-rules.yaml — 18 rule Sigma-style</w:t>
       </w:r>
     </w:p>
     <w:p>
@@ -1243,7 +1399,7 @@
         <w:pStyle w:val="ListBullet"/>
       </w:pPr>
       <w:r>
-        <w:t>scripts/ — deploy.sh, apply_rules.py, triage.py, daily_report.py, build_dashboard.py, alerts.py (draft), run_soc_detect.bat</w:t>
+        <w:t>scripts/ — deploy.sh, apply_rules.py, triage.py, daily_report.py, build_dashboard.py, alerts.py (draft), build_project_report.py, apply_rules (18 rule engine), enable_file_integrity_audit.ps1</w:t>
       </w:r>
     </w:p>
     <w:p>
@@ -1252,6 +1408,14 @@
       </w:pPr>
       <w:r>
         <w:t>dashboards/ — soc_overview.ndjson + SOC_OVERVIEW.md</w:t>
+      </w:r>
+    </w:p>
+    <w:p>
+      <w:pPr>
+        <w:pStyle w:val="ListBullet"/>
+      </w:pPr>
+      <w:r>
+        <w:t>sysmon/ — Sysmon FIM config (binaries gitignored EULA)</w:t>
       </w:r>
     </w:p>
     <w:p>
@@ -1294,6 +1458,14 @@
         <w:pStyle w:val="ListBullet"/>
       </w:pPr>
       <w:r>
+        <w:t>R-016 cần bật File System audit (auditpol + SACL) trên client; R-017/018 cần Sysmon installed với channel 'Microsoft-Windows-Sysmon/Operational' bật trong winlogbeat (như AGENTS.md).</w:t>
+      </w:r>
+    </w:p>
+    <w:p>
+      <w:pPr>
+        <w:pStyle w:val="ListBullet"/>
+      </w:pPr>
+      <w:r>
         <w:t>Alerting: alerts.py là bản nháp — cần nối Slack/Telegram webhook (SOC_ALERT_* env).</w:t>
       </w:r>
     </w:p>
@@ -1321,7 +1493,7 @@
         <w:rPr>
           <w:b w:val="0"/>
         </w:rPr>
-        <w:t>SOC-ify hoàn thành mục tiêu là một SOC thu nhỏ dạy được và có thể tái tạo trên Azure + Elasticsearch 8.12 + Kibana, không phụ thuộc giấy phép trả phí. Hệ thống đi từ phát hiện (15 rule + tương quan đa nguồn) đến triage và báo cáo, là nền tảng học SIEM/SOC và portfolio công việc vững chắc. Không phải SIEM sản xuất thương mại.</w:t>
+        <w:t>SOC-ify hoàn thành mục tiêu là một SOC thu nhỏ dạy được và có thể tái tạo trên Azure + Elasticsearch 8.12 + Kibana, không phụ thuộc giấy phép trả phí. Hệ thống đi từ phát hiện (18 rule: nginx web + UFW/SSH đa nguồn + Windows FIM) đến triage và báo cáo, là nền tảng học SIEM/SOC và portfolio công việc vững chắc. Không phải SIEM sản xuất thương mại.</w:t>
       </w:r>
     </w:p>
     <w:sectPr>

</xml_diff>